<commit_message>
Se agregan nuevos agentes para analisis de deteccion de fallos
</commit_message>
<xml_diff>
--- a/.axetrules/core/drivers/tests/golden/generate_report_fixture_golden.docx
+++ b/.axetrules/core/drivers/tests/golden/generate_report_fixture_golden.docx
@@ -42,7 +42,7 @@
           <w:color w:val="707070"/>
           <w:sz w:val="24"/>
         </w:rPr>
-        <w:t>19 de mayo de 2026</w:t>
+        <w:t>21 de mayo de 2026</w:t>
       </w:r>
     </w:p>
     <w:p/>
@@ -114,7 +114,7 @@
         <w:t>Fecha:</w:t>
       </w:r>
       <w:r>
-        <w:t xml:space="preserve"> 19 de mayo de 2026  </w:t>
+        <w:t xml:space="preserve"> 21 de mayo de 2026  </w:t>
       </w:r>
     </w:p>
     <w:p>
@@ -185,6 +185,7 @@
           <w:color w:val="555555"/>
         </w:rPr>
         <w:t>cita de validacion</w:t>
+        <w:br/>
       </w:r>
     </w:p>
     <w:p>
@@ -194,6 +195,7 @@
       </w:pPr>
       <w:r>
         <w:t>☐ pendiente</w:t>
+        <w:br/>
       </w:r>
     </w:p>
     <w:p>
@@ -315,11 +317,13 @@
     <w:p>
       <w:r>
         <w:t>| ascii | diag |</w:t>
+        <w:br/>
       </w:r>
     </w:p>
     <w:p>
       <w:r>
         <w:t>| sin | separador |</w:t>
+        <w:br/>
       </w:r>
     </w:p>
     <w:p>
@@ -364,6 +368,7 @@
           <w:sz w:val="18"/>
         </w:rPr>
         <w:t>print('hola')</w:t>
+        <w:br/>
       </w:r>
     </w:p>
     <w:p/>

</xml_diff>